<commit_message>
fix: add certifi SSL certificates for MongoDB Atlas on Render
</commit_message>
<xml_diff>
--- a/docs/Week_12_Render_Deployment.docx
+++ b/docs/Week_12_Render_Deployment.docx
@@ -72,19 +72,11 @@
           <w:color w:val="auto"/>
         </w:rPr>
       </w:pPr>
-      <w:proofErr w:type="gramStart"/>
       <w:r>
         <w:rPr>
           <w:color w:val="auto"/>
         </w:rPr>
-        <w:t>2.1  Connect</w:t>
-      </w:r>
-      <w:proofErr w:type="gramEnd"/>
-      <w:r>
-        <w:rPr>
-          <w:color w:val="auto"/>
-        </w:rPr>
-        <w:t xml:space="preserve"> GitHub Repository</w:t>
+        <w:t>2.1  Connect GitHub Repository</w:t>
       </w:r>
     </w:p>
     <w:p>
@@ -194,28 +186,7 @@
           <w:szCs w:val="24"/>
         </w:rPr>
         <w:br/>
-      </w:r>
-      <w:proofErr w:type="gramStart"/>
-      <w:r>
-        <w:rPr>
-          <w:rFonts w:ascii="Times New Roman" w:hAnsi="Times New Roman" w:cs="Times New Roman"/>
-          <w:b/>
-          <w:bCs/>
-          <w:sz w:val="24"/>
-          <w:szCs w:val="24"/>
-        </w:rPr>
-        <w:t>2.2  Build</w:t>
-      </w:r>
-      <w:proofErr w:type="gramEnd"/>
-      <w:r>
-        <w:rPr>
-          <w:rFonts w:ascii="Times New Roman" w:hAnsi="Times New Roman" w:cs="Times New Roman"/>
-          <w:b/>
-          <w:bCs/>
-          <w:sz w:val="24"/>
-          <w:szCs w:val="24"/>
-        </w:rPr>
-        <w:t xml:space="preserve"> &amp; Start Configuration</w:t>
+        <w:t>2.2  Build &amp; Start Configuration</w:t>
       </w:r>
     </w:p>
     <w:p>
@@ -599,66 +570,53 @@
       <w:r>
         <w:rPr>
           <w:rFonts w:ascii="Times New Roman" w:hAnsi="Times New Roman" w:cs="Times New Roman"/>
-          <w:color w:val="B47800"/>
-        </w:rPr>
-        <w:br/>
-      </w:r>
-      <w:proofErr w:type="gramStart"/>
-      <w:r>
-        <w:rPr>
-          <w:rFonts w:ascii="Segoe UI Emoji" w:hAnsi="Segoe UI Emoji" w:cs="Segoe UI Emoji"/>
-          <w:color w:val="B47800"/>
-        </w:rPr>
-        <w:t>📷</w:t>
+          <w:noProof/>
+        </w:rPr>
+        <w:drawing>
+          <wp:inline distT="0" distB="0" distL="0" distR="0" wp14:anchorId="32854EF8" wp14:editId="17D271E8">
+            <wp:extent cx="5972810" cy="3173095"/>
+            <wp:effectExtent l="0" t="0" r="8890" b="8255"/>
+            <wp:docPr id="1366162236" name="Picture 2"/>
+            <wp:cNvGraphicFramePr>
+              <a:graphicFrameLocks xmlns:a="http://schemas.openxmlformats.org/drawingml/2006/main" noChangeAspect="1"/>
+            </wp:cNvGraphicFramePr>
+            <a:graphic xmlns:a="http://schemas.openxmlformats.org/drawingml/2006/main">
+              <a:graphicData uri="http://schemas.openxmlformats.org/drawingml/2006/picture">
+                <pic:pic xmlns:pic="http://schemas.openxmlformats.org/drawingml/2006/picture">
+                  <pic:nvPicPr>
+                    <pic:cNvPr id="1366162236" name="Picture 1366162236"/>
+                    <pic:cNvPicPr/>
+                  </pic:nvPicPr>
+                  <pic:blipFill>
+                    <a:blip r:embed="rId9"/>
+                    <a:stretch>
+                      <a:fillRect/>
+                    </a:stretch>
+                  </pic:blipFill>
+                  <pic:spPr>
+                    <a:xfrm>
+                      <a:off x="0" y="0"/>
+                      <a:ext cx="5972810" cy="3173095"/>
+                    </a:xfrm>
+                    <a:prstGeom prst="rect">
+                      <a:avLst/>
+                    </a:prstGeom>
+                  </pic:spPr>
+                </pic:pic>
+              </a:graphicData>
+            </a:graphic>
+          </wp:inline>
+        </w:drawing>
       </w:r>
       <w:r>
         <w:rPr>
           <w:rFonts w:ascii="Times New Roman" w:hAnsi="Times New Roman" w:cs="Times New Roman"/>
-          <w:color w:val="B47800"/>
-        </w:rPr>
-        <w:t xml:space="preserve">  [</w:t>
-      </w:r>
-      <w:proofErr w:type="gramEnd"/>
-      <w:r>
-        <w:rPr>
-          <w:rFonts w:ascii="Times New Roman" w:hAnsi="Times New Roman" w:cs="Times New Roman"/>
-          <w:color w:val="B47800"/>
-        </w:rPr>
-        <w:t xml:space="preserve"> INSERT SCREENSHOT </w:t>
-      </w:r>
-      <w:proofErr w:type="gramStart"/>
-      <w:r>
-        <w:rPr>
-          <w:rFonts w:ascii="Times New Roman" w:hAnsi="Times New Roman" w:cs="Times New Roman"/>
-          <w:color w:val="B47800"/>
-        </w:rPr>
-        <w:t>HERE ]</w:t>
-      </w:r>
-      <w:proofErr w:type="gramEnd"/>
-      <w:r>
-        <w:rPr>
-          <w:rFonts w:ascii="Times New Roman" w:hAnsi="Times New Roman" w:cs="Times New Roman"/>
-          <w:color w:val="B47800"/>
         </w:rPr>
         <w:br/>
       </w:r>
       <w:r>
         <w:rPr>
           <w:rFonts w:ascii="Times New Roman" w:hAnsi="Times New Roman" w:cs="Times New Roman"/>
-          <w:color w:val="B47800"/>
-        </w:rPr>
-        <w:br/>
-      </w:r>
-    </w:p>
-    <w:p>
-      <w:pPr>
-        <w:rPr>
-          <w:rFonts w:ascii="Times New Roman" w:hAnsi="Times New Roman" w:cs="Times New Roman"/>
-        </w:rPr>
-      </w:pPr>
-      <w:r>
-        <w:rPr>
-          <w:rFonts w:ascii="Times New Roman" w:hAnsi="Times New Roman" w:cs="Times New Roman"/>
         </w:rPr>
         <w:br/>
       </w:r>
@@ -679,27 +637,6 @@
           <w:rFonts w:ascii="Times New Roman" w:hAnsi="Times New Roman" w:cs="Times New Roman"/>
         </w:rPr>
         <w:br/>
-      </w:r>
-      <w:r>
-        <w:rPr>
-          <w:rFonts w:ascii="Times New Roman" w:hAnsi="Times New Roman" w:cs="Times New Roman"/>
-        </w:rPr>
-        <w:br/>
-      </w:r>
-    </w:p>
-    <w:p>
-      <w:pPr>
-        <w:rPr>
-          <w:rFonts w:ascii="Times New Roman" w:hAnsi="Times New Roman" w:cs="Times New Roman"/>
-        </w:rPr>
-      </w:pPr>
-      <w:r>
-        <w:rPr>
-          <w:rFonts w:ascii="Times New Roman" w:hAnsi="Times New Roman" w:cs="Times New Roman"/>
-          <w:i/>
-          <w:color w:val="646464"/>
-        </w:rPr>
-        <w:t>Figure 2: Render.com — Build &amp; Start Command Configuration Page</w:t>
       </w:r>
     </w:p>
     <w:p>
@@ -1061,42 +998,44 @@
       <w:r>
         <w:rPr>
           <w:rFonts w:ascii="Times New Roman" w:hAnsi="Times New Roman" w:cs="Times New Roman"/>
-          <w:color w:val="B47800"/>
-        </w:rPr>
-        <w:br/>
+          <w:noProof/>
+        </w:rPr>
+        <w:drawing>
+          <wp:inline distT="0" distB="0" distL="0" distR="0" wp14:anchorId="3C1CAF41" wp14:editId="026E4251">
+            <wp:extent cx="5972810" cy="3172460"/>
+            <wp:effectExtent l="0" t="0" r="8890" b="8890"/>
+            <wp:docPr id="988223701" name="Picture 3"/>
+            <wp:cNvGraphicFramePr>
+              <a:graphicFrameLocks xmlns:a="http://schemas.openxmlformats.org/drawingml/2006/main" noChangeAspect="1"/>
+            </wp:cNvGraphicFramePr>
+            <a:graphic xmlns:a="http://schemas.openxmlformats.org/drawingml/2006/main">
+              <a:graphicData uri="http://schemas.openxmlformats.org/drawingml/2006/picture">
+                <pic:pic xmlns:pic="http://schemas.openxmlformats.org/drawingml/2006/picture">
+                  <pic:nvPicPr>
+                    <pic:cNvPr id="988223701" name="Picture 3"/>
+                    <pic:cNvPicPr/>
+                  </pic:nvPicPr>
+                  <pic:blipFill>
+                    <a:blip r:embed="rId10"/>
+                    <a:stretch>
+                      <a:fillRect/>
+                    </a:stretch>
+                  </pic:blipFill>
+                  <pic:spPr>
+                    <a:xfrm>
+                      <a:off x="0" y="0"/>
+                      <a:ext cx="5972810" cy="3172460"/>
+                    </a:xfrm>
+                    <a:prstGeom prst="rect">
+                      <a:avLst/>
+                    </a:prstGeom>
+                  </pic:spPr>
+                </pic:pic>
+              </a:graphicData>
+            </a:graphic>
+          </wp:inline>
+        </w:drawing>
       </w:r>
-      <w:proofErr w:type="gramStart"/>
-      <w:r>
-        <w:rPr>
-          <w:rFonts w:ascii="Segoe UI Emoji" w:hAnsi="Segoe UI Emoji" w:cs="Segoe UI Emoji"/>
-          <w:color w:val="B47800"/>
-        </w:rPr>
-        <w:t>📷</w:t>
-      </w:r>
-      <w:r>
-        <w:rPr>
-          <w:rFonts w:ascii="Times New Roman" w:hAnsi="Times New Roman" w:cs="Times New Roman"/>
-          <w:color w:val="B47800"/>
-        </w:rPr>
-        <w:t xml:space="preserve">  [</w:t>
-      </w:r>
-      <w:proofErr w:type="gramEnd"/>
-      <w:r>
-        <w:rPr>
-          <w:rFonts w:ascii="Times New Roman" w:hAnsi="Times New Roman" w:cs="Times New Roman"/>
-          <w:color w:val="B47800"/>
-        </w:rPr>
-        <w:t xml:space="preserve"> INSERT SCREENSHOT </w:t>
-      </w:r>
-      <w:proofErr w:type="gramStart"/>
-      <w:r>
-        <w:rPr>
-          <w:rFonts w:ascii="Times New Roman" w:hAnsi="Times New Roman" w:cs="Times New Roman"/>
-          <w:color w:val="B47800"/>
-        </w:rPr>
-        <w:t>HERE ]</w:t>
-      </w:r>
-      <w:proofErr w:type="gramEnd"/>
       <w:r>
         <w:rPr>
           <w:rFonts w:ascii="Times New Roman" w:hAnsi="Times New Roman" w:cs="Times New Roman"/>
@@ -1194,6 +1133,7 @@
         <w:rPr>
           <w:rFonts w:ascii="Times New Roman" w:hAnsi="Times New Roman" w:cs="Times New Roman"/>
         </w:rPr>
+        <w:lastRenderedPageBreak/>
         <w:t>After clicking 'Deploy Web Service', Render automatically pulled the latest code from GitHub, installed dependencies from requirements.txt, and started the Gunicorn WSGI server.</w:t>
       </w:r>
     </w:p>
@@ -1203,21 +1143,12 @@
           <w:rFonts w:ascii="Times New Roman" w:hAnsi="Times New Roman" w:cs="Times New Roman"/>
         </w:rPr>
       </w:pPr>
-      <w:proofErr w:type="gramStart"/>
       <w:r>
         <w:rPr>
           <w:rFonts w:ascii="Times New Roman" w:hAnsi="Times New Roman" w:cs="Times New Roman"/>
           <w:color w:val="005096"/>
         </w:rPr>
-        <w:t>4.1  Build</w:t>
-      </w:r>
-      <w:proofErr w:type="gramEnd"/>
-      <w:r>
-        <w:rPr>
-          <w:rFonts w:ascii="Times New Roman" w:hAnsi="Times New Roman" w:cs="Times New Roman"/>
-          <w:color w:val="005096"/>
-        </w:rPr>
-        <w:t xml:space="preserve"> Process</w:t>
+        <w:t>4.1  Build Process</w:t>
       </w:r>
     </w:p>
     <w:p>
@@ -1343,7 +1274,6 @@
           <w:rFonts w:ascii="Times New Roman" w:hAnsi="Times New Roman" w:cs="Times New Roman"/>
           <w:color w:val="141450"/>
         </w:rPr>
-        <w:lastRenderedPageBreak/>
         <w:t xml:space="preserve">    [INFO] Starting gunicorn 21.2.0</w:t>
       </w:r>
     </w:p>
@@ -1416,7 +1346,6 @@
         </w:rPr>
         <w:br/>
       </w:r>
-      <w:proofErr w:type="gramStart"/>
       <w:r>
         <w:rPr>
           <w:rFonts w:ascii="Segoe UI Emoji" w:hAnsi="Segoe UI Emoji" w:cs="Segoe UI Emoji"/>
@@ -1429,25 +1358,8 @@
           <w:rFonts w:ascii="Times New Roman" w:hAnsi="Times New Roman" w:cs="Times New Roman"/>
           <w:color w:val="B47800"/>
         </w:rPr>
-        <w:t xml:space="preserve">  [</w:t>
+        <w:t xml:space="preserve">  [ INSERT SCREENSHOT HERE ]</w:t>
       </w:r>
-      <w:proofErr w:type="gramEnd"/>
-      <w:r>
-        <w:rPr>
-          <w:rFonts w:ascii="Times New Roman" w:hAnsi="Times New Roman" w:cs="Times New Roman"/>
-          <w:color w:val="B47800"/>
-        </w:rPr>
-        <w:t xml:space="preserve"> INSERT SCREENSHOT </w:t>
-      </w:r>
-      <w:proofErr w:type="gramStart"/>
-      <w:r>
-        <w:rPr>
-          <w:rFonts w:ascii="Times New Roman" w:hAnsi="Times New Roman" w:cs="Times New Roman"/>
-          <w:color w:val="B47800"/>
-        </w:rPr>
-        <w:t>HERE ]</w:t>
-      </w:r>
-      <w:proofErr w:type="gramEnd"/>
       <w:r>
         <w:rPr>
           <w:rFonts w:ascii="Times New Roman" w:hAnsi="Times New Roman" w:cs="Times New Roman"/>
@@ -1528,21 +1440,12 @@
           <w:rFonts w:ascii="Times New Roman" w:hAnsi="Times New Roman" w:cs="Times New Roman"/>
         </w:rPr>
       </w:pPr>
-      <w:proofErr w:type="gramStart"/>
       <w:r>
         <w:rPr>
           <w:rFonts w:ascii="Times New Roman" w:hAnsi="Times New Roman" w:cs="Times New Roman"/>
           <w:color w:val="005096"/>
         </w:rPr>
-        <w:t>4.2  Live</w:t>
-      </w:r>
-      <w:proofErr w:type="gramEnd"/>
-      <w:r>
-        <w:rPr>
-          <w:rFonts w:ascii="Times New Roman" w:hAnsi="Times New Roman" w:cs="Times New Roman"/>
-          <w:color w:val="005096"/>
-        </w:rPr>
-        <w:t xml:space="preserve"> URL Generated</w:t>
+        <w:t>4.2  Live URL Generated</w:t>
       </w:r>
     </w:p>
     <w:p>
@@ -1583,6 +1486,7 @@
           <w:rFonts w:ascii="Times New Roman" w:hAnsi="Times New Roman" w:cs="Times New Roman"/>
           <w:color w:val="141450"/>
         </w:rPr>
+        <w:lastRenderedPageBreak/>
         <w:t xml:space="preserve">Status:   </w:t>
       </w:r>
       <w:r>
@@ -1660,21 +1564,12 @@
           <w:rFonts w:ascii="Times New Roman" w:hAnsi="Times New Roman" w:cs="Times New Roman"/>
         </w:rPr>
       </w:pPr>
-      <w:proofErr w:type="gramStart"/>
       <w:r>
         <w:rPr>
           <w:rFonts w:ascii="Times New Roman" w:hAnsi="Times New Roman" w:cs="Times New Roman"/>
           <w:color w:val="005096"/>
         </w:rPr>
-        <w:t>5.1  Login</w:t>
-      </w:r>
-      <w:proofErr w:type="gramEnd"/>
-      <w:r>
-        <w:rPr>
-          <w:rFonts w:ascii="Times New Roman" w:hAnsi="Times New Roman" w:cs="Times New Roman"/>
-          <w:color w:val="005096"/>
-        </w:rPr>
-        <w:t xml:space="preserve"> Page — Live Output</w:t>
+        <w:t>5.1  Login Page — Live Output</w:t>
       </w:r>
     </w:p>
     <w:p>
@@ -1703,7 +1598,6 @@
         </w:rPr>
         <w:br/>
       </w:r>
-      <w:proofErr w:type="gramStart"/>
       <w:r>
         <w:rPr>
           <w:rFonts w:ascii="Segoe UI Emoji" w:hAnsi="Segoe UI Emoji" w:cs="Segoe UI Emoji"/>
@@ -1716,25 +1610,8 @@
           <w:rFonts w:ascii="Times New Roman" w:hAnsi="Times New Roman" w:cs="Times New Roman"/>
           <w:color w:val="B47800"/>
         </w:rPr>
-        <w:t xml:space="preserve">  [</w:t>
+        <w:t xml:space="preserve">  [ INSERT SCREENSHOT HERE ]</w:t>
       </w:r>
-      <w:proofErr w:type="gramEnd"/>
-      <w:r>
-        <w:rPr>
-          <w:rFonts w:ascii="Times New Roman" w:hAnsi="Times New Roman" w:cs="Times New Roman"/>
-          <w:color w:val="B47800"/>
-        </w:rPr>
-        <w:t xml:space="preserve"> INSERT SCREENSHOT </w:t>
-      </w:r>
-      <w:proofErr w:type="gramStart"/>
-      <w:r>
-        <w:rPr>
-          <w:rFonts w:ascii="Times New Roman" w:hAnsi="Times New Roman" w:cs="Times New Roman"/>
-          <w:color w:val="B47800"/>
-        </w:rPr>
-        <w:t>HERE ]</w:t>
-      </w:r>
-      <w:proofErr w:type="gramEnd"/>
       <w:r>
         <w:rPr>
           <w:rFonts w:ascii="Times New Roman" w:hAnsi="Times New Roman" w:cs="Times New Roman"/>
@@ -1808,21 +1685,12 @@
           <w:rFonts w:ascii="Times New Roman" w:hAnsi="Times New Roman" w:cs="Times New Roman"/>
         </w:rPr>
       </w:pPr>
-      <w:proofErr w:type="gramStart"/>
       <w:r>
         <w:rPr>
           <w:rFonts w:ascii="Times New Roman" w:hAnsi="Times New Roman" w:cs="Times New Roman"/>
           <w:color w:val="005096"/>
         </w:rPr>
-        <w:t>5.2  Admin</w:t>
-      </w:r>
-      <w:proofErr w:type="gramEnd"/>
-      <w:r>
-        <w:rPr>
-          <w:rFonts w:ascii="Times New Roman" w:hAnsi="Times New Roman" w:cs="Times New Roman"/>
-          <w:color w:val="005096"/>
-        </w:rPr>
-        <w:t xml:space="preserve"> Dashboard — Live Output</w:t>
+        <w:t>5.2  Admin Dashboard — Live Output</w:t>
       </w:r>
     </w:p>
     <w:p>
@@ -1851,7 +1719,6 @@
         </w:rPr>
         <w:br/>
       </w:r>
-      <w:proofErr w:type="gramStart"/>
       <w:r>
         <w:rPr>
           <w:rFonts w:ascii="Segoe UI Emoji" w:hAnsi="Segoe UI Emoji" w:cs="Segoe UI Emoji"/>
@@ -1864,25 +1731,8 @@
           <w:rFonts w:ascii="Times New Roman" w:hAnsi="Times New Roman" w:cs="Times New Roman"/>
           <w:color w:val="B47800"/>
         </w:rPr>
-        <w:t xml:space="preserve">  [</w:t>
+        <w:t xml:space="preserve">  [ INSERT SCREENSHOT HERE ]</w:t>
       </w:r>
-      <w:proofErr w:type="gramEnd"/>
-      <w:r>
-        <w:rPr>
-          <w:rFonts w:ascii="Times New Roman" w:hAnsi="Times New Roman" w:cs="Times New Roman"/>
-          <w:color w:val="B47800"/>
-        </w:rPr>
-        <w:t xml:space="preserve"> INSERT SCREENSHOT </w:t>
-      </w:r>
-      <w:proofErr w:type="gramStart"/>
-      <w:r>
-        <w:rPr>
-          <w:rFonts w:ascii="Times New Roman" w:hAnsi="Times New Roman" w:cs="Times New Roman"/>
-          <w:color w:val="B47800"/>
-        </w:rPr>
-        <w:t>HERE ]</w:t>
-      </w:r>
-      <w:proofErr w:type="gramEnd"/>
       <w:r>
         <w:rPr>
           <w:rFonts w:ascii="Times New Roman" w:hAnsi="Times New Roman" w:cs="Times New Roman"/>
@@ -1969,22 +1819,13 @@
           <w:rFonts w:ascii="Times New Roman" w:hAnsi="Times New Roman" w:cs="Times New Roman"/>
         </w:rPr>
       </w:pPr>
-      <w:proofErr w:type="gramStart"/>
       <w:r>
         <w:rPr>
           <w:rFonts w:ascii="Times New Roman" w:hAnsi="Times New Roman" w:cs="Times New Roman"/>
           <w:color w:val="005096"/>
         </w:rPr>
         <w:lastRenderedPageBreak/>
-        <w:t>5.3  Student</w:t>
-      </w:r>
-      <w:proofErr w:type="gramEnd"/>
-      <w:r>
-        <w:rPr>
-          <w:rFonts w:ascii="Times New Roman" w:hAnsi="Times New Roman" w:cs="Times New Roman"/>
-          <w:color w:val="005096"/>
-        </w:rPr>
-        <w:t xml:space="preserve"> Dashboard — Live Output</w:t>
+        <w:t>5.3  Student Dashboard — Live Output</w:t>
       </w:r>
     </w:p>
     <w:p>
@@ -2013,7 +1854,6 @@
         </w:rPr>
         <w:br/>
       </w:r>
-      <w:proofErr w:type="gramStart"/>
       <w:r>
         <w:rPr>
           <w:rFonts w:ascii="Segoe UI Emoji" w:hAnsi="Segoe UI Emoji" w:cs="Segoe UI Emoji"/>
@@ -2026,25 +1866,8 @@
           <w:rFonts w:ascii="Times New Roman" w:hAnsi="Times New Roman" w:cs="Times New Roman"/>
           <w:color w:val="B47800"/>
         </w:rPr>
-        <w:t xml:space="preserve">  [</w:t>
+        <w:t xml:space="preserve">  [ INSERT SCREENSHOT HERE ]</w:t>
       </w:r>
-      <w:proofErr w:type="gramEnd"/>
-      <w:r>
-        <w:rPr>
-          <w:rFonts w:ascii="Times New Roman" w:hAnsi="Times New Roman" w:cs="Times New Roman"/>
-          <w:color w:val="B47800"/>
-        </w:rPr>
-        <w:t xml:space="preserve"> INSERT SCREENSHOT </w:t>
-      </w:r>
-      <w:proofErr w:type="gramStart"/>
-      <w:r>
-        <w:rPr>
-          <w:rFonts w:ascii="Times New Roman" w:hAnsi="Times New Roman" w:cs="Times New Roman"/>
-          <w:color w:val="B47800"/>
-        </w:rPr>
-        <w:t>HERE ]</w:t>
-      </w:r>
-      <w:proofErr w:type="gramEnd"/>
       <w:r>
         <w:rPr>
           <w:rFonts w:ascii="Times New Roman" w:hAnsi="Times New Roman" w:cs="Times New Roman"/>
@@ -2118,21 +1941,12 @@
           <w:rFonts w:ascii="Times New Roman" w:hAnsi="Times New Roman" w:cs="Times New Roman"/>
         </w:rPr>
       </w:pPr>
-      <w:proofErr w:type="gramStart"/>
       <w:r>
         <w:rPr>
           <w:rFonts w:ascii="Times New Roman" w:hAnsi="Times New Roman" w:cs="Times New Roman"/>
           <w:color w:val="005096"/>
         </w:rPr>
-        <w:t>5.4  Diagnostic</w:t>
-      </w:r>
-      <w:proofErr w:type="gramEnd"/>
-      <w:r>
-        <w:rPr>
-          <w:rFonts w:ascii="Times New Roman" w:hAnsi="Times New Roman" w:cs="Times New Roman"/>
-          <w:color w:val="005096"/>
-        </w:rPr>
-        <w:t xml:space="preserve"> Test — Live Output</w:t>
+        <w:t>5.4  Diagnostic Test — Live Output</w:t>
       </w:r>
     </w:p>
     <w:p>
@@ -2161,7 +1975,6 @@
         </w:rPr>
         <w:br/>
       </w:r>
-      <w:proofErr w:type="gramStart"/>
       <w:r>
         <w:rPr>
           <w:rFonts w:ascii="Segoe UI Emoji" w:hAnsi="Segoe UI Emoji" w:cs="Segoe UI Emoji"/>
@@ -2174,25 +1987,8 @@
           <w:rFonts w:ascii="Times New Roman" w:hAnsi="Times New Roman" w:cs="Times New Roman"/>
           <w:color w:val="B47800"/>
         </w:rPr>
-        <w:t xml:space="preserve">  [</w:t>
+        <w:t xml:space="preserve">  [ INSERT SCREENSHOT HERE ]</w:t>
       </w:r>
-      <w:proofErr w:type="gramEnd"/>
-      <w:r>
-        <w:rPr>
-          <w:rFonts w:ascii="Times New Roman" w:hAnsi="Times New Roman" w:cs="Times New Roman"/>
-          <w:color w:val="B47800"/>
-        </w:rPr>
-        <w:t xml:space="preserve"> INSERT SCREENSHOT </w:t>
-      </w:r>
-      <w:proofErr w:type="gramStart"/>
-      <w:r>
-        <w:rPr>
-          <w:rFonts w:ascii="Times New Roman" w:hAnsi="Times New Roman" w:cs="Times New Roman"/>
-          <w:color w:val="B47800"/>
-        </w:rPr>
-        <w:t>HERE ]</w:t>
-      </w:r>
-      <w:proofErr w:type="gramEnd"/>
       <w:r>
         <w:rPr>
           <w:rFonts w:ascii="Times New Roman" w:hAnsi="Times New Roman" w:cs="Times New Roman"/>
@@ -3669,71 +3465,7 @@
           <w:rFonts w:ascii="Times New Roman" w:hAnsi="Times New Roman" w:cs="Times New Roman"/>
           <w:color w:val="969696"/>
         </w:rPr>
-        <w:t xml:space="preserve">GapLens </w:t>
-      </w:r>
-      <w:proofErr w:type="gramStart"/>
-      <w:r>
-        <w:rPr>
-          <w:rFonts w:ascii="Times New Roman" w:hAnsi="Times New Roman" w:cs="Times New Roman"/>
-          <w:color w:val="969696"/>
-        </w:rPr>
-        <w:t>Platform  •</w:t>
-      </w:r>
-      <w:proofErr w:type="gramEnd"/>
-      <w:r>
-        <w:rPr>
-          <w:rFonts w:ascii="Times New Roman" w:hAnsi="Times New Roman" w:cs="Times New Roman"/>
-          <w:color w:val="969696"/>
-        </w:rPr>
-        <w:t xml:space="preserve">  Week 12 — Deployment &amp; Final </w:t>
-      </w:r>
-      <w:proofErr w:type="gramStart"/>
-      <w:r>
-        <w:rPr>
-          <w:rFonts w:ascii="Times New Roman" w:hAnsi="Times New Roman" w:cs="Times New Roman"/>
-          <w:color w:val="969696"/>
-        </w:rPr>
-        <w:t>Review  •</w:t>
-      </w:r>
-      <w:proofErr w:type="gramEnd"/>
-      <w:r>
-        <w:rPr>
-          <w:rFonts w:ascii="Times New Roman" w:hAnsi="Times New Roman" w:cs="Times New Roman"/>
-          <w:color w:val="969696"/>
-        </w:rPr>
-        <w:t xml:space="preserve">  Team B-G</w:t>
-      </w:r>
-      <w:proofErr w:type="gramStart"/>
-      <w:r>
-        <w:rPr>
-          <w:rFonts w:ascii="Times New Roman" w:hAnsi="Times New Roman" w:cs="Times New Roman"/>
-          <w:color w:val="969696"/>
-        </w:rPr>
-        <w:t>12  •</w:t>
-      </w:r>
-      <w:proofErr w:type="gramEnd"/>
-      <w:r>
-        <w:rPr>
-          <w:rFonts w:ascii="Times New Roman" w:hAnsi="Times New Roman" w:cs="Times New Roman"/>
-          <w:color w:val="969696"/>
-        </w:rPr>
-        <w:t xml:space="preserve">  </w:t>
-      </w:r>
-      <w:proofErr w:type="gramStart"/>
-      <w:r>
-        <w:rPr>
-          <w:rFonts w:ascii="Times New Roman" w:hAnsi="Times New Roman" w:cs="Times New Roman"/>
-          <w:color w:val="969696"/>
-        </w:rPr>
-        <w:t>SVIIT  •</w:t>
-      </w:r>
-      <w:proofErr w:type="gramEnd"/>
-      <w:r>
-        <w:rPr>
-          <w:rFonts w:ascii="Times New Roman" w:hAnsi="Times New Roman" w:cs="Times New Roman"/>
-          <w:color w:val="969696"/>
-        </w:rPr>
-        <w:t xml:space="preserve">  2026</w:t>
+        <w:t>GapLens Platform  •  Week 12 — Deployment &amp; Final Review  •  Team B-G12  •  SVIIT  •  2026</w:t>
       </w:r>
     </w:p>
     <w:sectPr>

</xml_diff>

<commit_message>
fix: smart TLS handling + seed admin try-except for Render
</commit_message>
<xml_diff>
--- a/docs/Week_12_Render_Deployment.docx
+++ b/docs/Week_12_Render_Deployment.docx
@@ -1081,6 +1081,290 @@
         </w:rPr>
         <w:br/>
       </w:r>
+    </w:p>
+    <w:p>
+      <w:pPr>
+        <w:rPr>
+          <w:rFonts w:ascii="Times New Roman" w:hAnsi="Times New Roman" w:cs="Times New Roman"/>
+        </w:rPr>
+      </w:pPr>
+      <w:r>
+        <w:rPr>
+          <w:rFonts w:ascii="Times New Roman" w:hAnsi="Times New Roman" w:cs="Times New Roman"/>
+        </w:rPr>
+        <w:t>4. Step 3: Deployment &amp; Build Log</w:t>
+      </w:r>
+    </w:p>
+    <w:p>
+      <w:pPr>
+        <w:rPr>
+          <w:rFonts w:ascii="Times New Roman" w:hAnsi="Times New Roman" w:cs="Times New Roman"/>
+        </w:rPr>
+      </w:pPr>
+      <w:r>
+        <w:rPr>
+          <w:rFonts w:ascii="Times New Roman" w:hAnsi="Times New Roman" w:cs="Times New Roman"/>
+        </w:rPr>
+        <w:t>After clicking 'Deploy Web Service', Render automatically pulled the latest code from GitHub, installed dependencies from requirements.txt, and started the Gunicorn WSGI server.</w:t>
+      </w:r>
+    </w:p>
+    <w:p>
+      <w:pPr>
+        <w:rPr>
+          <w:rFonts w:ascii="Times New Roman" w:hAnsi="Times New Roman" w:cs="Times New Roman"/>
+        </w:rPr>
+      </w:pPr>
+      <w:r>
+        <w:rPr>
+          <w:rFonts w:ascii="Times New Roman" w:hAnsi="Times New Roman" w:cs="Times New Roman"/>
+          <w:color w:val="005096"/>
+        </w:rPr>
+        <w:t>4.1  Build Process</w:t>
+      </w:r>
+    </w:p>
+    <w:p>
+      <w:pPr>
+        <w:rPr>
+          <w:rFonts w:ascii="Times New Roman" w:hAnsi="Times New Roman" w:cs="Times New Roman"/>
+        </w:rPr>
+      </w:pPr>
+      <w:r>
+        <w:rPr>
+          <w:rFonts w:ascii="Times New Roman" w:hAnsi="Times New Roman" w:cs="Times New Roman"/>
+          <w:color w:val="141450"/>
+        </w:rPr>
+        <w:t>==&gt; Cloning from https://github.com/NAYAN-014/Gaplense-.git</w:t>
+      </w:r>
+    </w:p>
+    <w:p>
+      <w:pPr>
+        <w:rPr>
+          <w:rFonts w:ascii="Times New Roman" w:hAnsi="Times New Roman" w:cs="Times New Roman"/>
+        </w:rPr>
+      </w:pPr>
+      <w:r>
+        <w:rPr>
+          <w:rFonts w:ascii="Times New Roman" w:hAnsi="Times New Roman" w:cs="Times New Roman"/>
+          <w:color w:val="141450"/>
+        </w:rPr>
+        <w:lastRenderedPageBreak/>
+        <w:t>==&gt; Using Python version: 3.11.0</w:t>
+      </w:r>
+    </w:p>
+    <w:p>
+      <w:pPr>
+        <w:rPr>
+          <w:rFonts w:ascii="Times New Roman" w:hAnsi="Times New Roman" w:cs="Times New Roman"/>
+        </w:rPr>
+      </w:pPr>
+      <w:r>
+        <w:rPr>
+          <w:rFonts w:ascii="Times New Roman" w:hAnsi="Times New Roman" w:cs="Times New Roman"/>
+          <w:color w:val="141450"/>
+        </w:rPr>
+        <w:t>==&gt; Running build command: pip install -r requirements.txt</w:t>
+      </w:r>
+    </w:p>
+    <w:p>
+      <w:pPr>
+        <w:rPr>
+          <w:rFonts w:ascii="Times New Roman" w:hAnsi="Times New Roman" w:cs="Times New Roman"/>
+        </w:rPr>
+      </w:pPr>
+      <w:r>
+        <w:rPr>
+          <w:rFonts w:ascii="Times New Roman" w:hAnsi="Times New Roman" w:cs="Times New Roman"/>
+          <w:color w:val="141450"/>
+        </w:rPr>
+        <w:t xml:space="preserve">    Installing flask, pymongo, gunicorn...</w:t>
+      </w:r>
+    </w:p>
+    <w:p>
+      <w:pPr>
+        <w:rPr>
+          <w:rFonts w:ascii="Times New Roman" w:hAnsi="Times New Roman" w:cs="Times New Roman"/>
+        </w:rPr>
+      </w:pPr>
+      <w:r>
+        <w:rPr>
+          <w:rFonts w:ascii="Times New Roman" w:hAnsi="Times New Roman" w:cs="Times New Roman"/>
+          <w:color w:val="141450"/>
+        </w:rPr>
+        <w:t xml:space="preserve">    Successfully installed 42 packages</w:t>
+      </w:r>
+    </w:p>
+    <w:p>
+      <w:pPr>
+        <w:rPr>
+          <w:rFonts w:ascii="Times New Roman" w:hAnsi="Times New Roman" w:cs="Times New Roman"/>
+        </w:rPr>
+      </w:pPr>
+      <w:r>
+        <w:rPr>
+          <w:rFonts w:ascii="Times New Roman" w:hAnsi="Times New Roman" w:cs="Times New Roman"/>
+          <w:color w:val="141450"/>
+        </w:rPr>
+        <w:t xml:space="preserve">==&gt; Build successful </w:t>
+      </w:r>
+      <w:r>
+        <w:rPr>
+          <w:rFonts w:ascii="Segoe UI Symbol" w:hAnsi="Segoe UI Symbol" w:cs="Segoe UI Symbol"/>
+          <w:color w:val="141450"/>
+        </w:rPr>
+        <w:t>✓</w:t>
+      </w:r>
+    </w:p>
+    <w:p>
+      <w:pPr>
+        <w:rPr>
+          <w:rFonts w:ascii="Times New Roman" w:hAnsi="Times New Roman" w:cs="Times New Roman"/>
+        </w:rPr>
+      </w:pPr>
+    </w:p>
+    <w:p>
+      <w:pPr>
+        <w:rPr>
+          <w:rFonts w:ascii="Times New Roman" w:hAnsi="Times New Roman" w:cs="Times New Roman"/>
+        </w:rPr>
+      </w:pPr>
+      <w:r>
+        <w:rPr>
+          <w:rFonts w:ascii="Times New Roman" w:hAnsi="Times New Roman" w:cs="Times New Roman"/>
+          <w:color w:val="141450"/>
+        </w:rPr>
+        <w:t>==&gt; Starting service with: gunicorn run:app</w:t>
+      </w:r>
+    </w:p>
+    <w:p>
+      <w:pPr>
+        <w:rPr>
+          <w:rFonts w:ascii="Times New Roman" w:hAnsi="Times New Roman" w:cs="Times New Roman"/>
+        </w:rPr>
+      </w:pPr>
+      <w:r>
+        <w:rPr>
+          <w:rFonts w:ascii="Times New Roman" w:hAnsi="Times New Roman" w:cs="Times New Roman"/>
+          <w:color w:val="141450"/>
+        </w:rPr>
+        <w:t xml:space="preserve">    [INFO] Starting gunicorn 21.2.0</w:t>
+      </w:r>
+    </w:p>
+    <w:p>
+      <w:pPr>
+        <w:rPr>
+          <w:rFonts w:ascii="Times New Roman" w:hAnsi="Times New Roman" w:cs="Times New Roman"/>
+        </w:rPr>
+      </w:pPr>
+      <w:r>
+        <w:rPr>
+          <w:rFonts w:ascii="Times New Roman" w:hAnsi="Times New Roman" w:cs="Times New Roman"/>
+          <w:color w:val="141450"/>
+        </w:rPr>
+        <w:t xml:space="preserve">    [INFO] Listening at: http://0.0.0.0:10000</w:t>
+      </w:r>
+    </w:p>
+    <w:p>
+      <w:pPr>
+        <w:rPr>
+          <w:rFonts w:ascii="Times New Roman" w:hAnsi="Times New Roman" w:cs="Times New Roman"/>
+        </w:rPr>
+      </w:pPr>
+      <w:r>
+        <w:rPr>
+          <w:rFonts w:ascii="Times New Roman" w:hAnsi="Times New Roman" w:cs="Times New Roman"/>
+          <w:color w:val="141450"/>
+        </w:rPr>
+        <w:t xml:space="preserve">    [INFO] Worker(s) booted successfully</w:t>
+      </w:r>
+    </w:p>
+    <w:p>
+      <w:pPr>
+        <w:rPr>
+          <w:rFonts w:ascii="Times New Roman" w:hAnsi="Times New Roman" w:cs="Times New Roman"/>
+        </w:rPr>
+      </w:pPr>
+      <w:r>
+        <w:rPr>
+          <w:rFonts w:ascii="Times New Roman" w:hAnsi="Times New Roman" w:cs="Times New Roman"/>
+          <w:color w:val="141450"/>
+        </w:rPr>
+        <w:t xml:space="preserve">==&gt; Your service is live </w:t>
+      </w:r>
+      <w:r>
+        <w:rPr>
+          <w:rFonts w:ascii="Segoe UI Emoji" w:hAnsi="Segoe UI Emoji" w:cs="Segoe UI Emoji"/>
+          <w:color w:val="141450"/>
+        </w:rPr>
+        <w:t>🎉</w:t>
+      </w:r>
+    </w:p>
+    <w:p>
+      <w:pPr>
+        <w:rPr>
+          <w:rFonts w:ascii="Times New Roman" w:hAnsi="Times New Roman" w:cs="Times New Roman"/>
+        </w:rPr>
+      </w:pPr>
+    </w:p>
+    <w:p>
+      <w:pPr>
+        <w:rPr>
+          <w:rFonts w:ascii="Times New Roman" w:hAnsi="Times New Roman" w:cs="Times New Roman"/>
+        </w:rPr>
+      </w:pPr>
+      <w:r>
+        <w:rPr>
+          <w:rFonts w:ascii="Times New Roman" w:hAnsi="Times New Roman" w:cs="Times New Roman"/>
+          <w:noProof/>
+        </w:rPr>
+        <w:drawing>
+          <wp:inline distT="0" distB="0" distL="0" distR="0" wp14:anchorId="24D52431" wp14:editId="1FDA237A">
+            <wp:extent cx="5972810" cy="3173095"/>
+            <wp:effectExtent l="0" t="0" r="8890" b="8255"/>
+            <wp:docPr id="1954493887" name="Picture 1"/>
+            <wp:cNvGraphicFramePr>
+              <a:graphicFrameLocks xmlns:a="http://schemas.openxmlformats.org/drawingml/2006/main" noChangeAspect="1"/>
+            </wp:cNvGraphicFramePr>
+            <a:graphic xmlns:a="http://schemas.openxmlformats.org/drawingml/2006/main">
+              <a:graphicData uri="http://schemas.openxmlformats.org/drawingml/2006/picture">
+                <pic:pic xmlns:pic="http://schemas.openxmlformats.org/drawingml/2006/picture">
+                  <pic:nvPicPr>
+                    <pic:cNvPr id="1954493887" name=""/>
+                    <pic:cNvPicPr/>
+                  </pic:nvPicPr>
+                  <pic:blipFill>
+                    <a:blip r:embed="rId11"/>
+                    <a:stretch>
+                      <a:fillRect/>
+                    </a:stretch>
+                  </pic:blipFill>
+                  <pic:spPr>
+                    <a:xfrm>
+                      <a:off x="0" y="0"/>
+                      <a:ext cx="5972810" cy="3173095"/>
+                    </a:xfrm>
+                    <a:prstGeom prst="rect">
+                      <a:avLst/>
+                    </a:prstGeom>
+                  </pic:spPr>
+                </pic:pic>
+              </a:graphicData>
+            </a:graphic>
+          </wp:inline>
+        </w:drawing>
+      </w:r>
+      <w:r>
+        <w:rPr>
+          <w:rFonts w:ascii="Times New Roman" w:hAnsi="Times New Roman" w:cs="Times New Roman"/>
+          <w:noProof/>
+        </w:rPr>
+        <w:t xml:space="preserve"> </w:t>
+      </w:r>
+      <w:r>
+        <w:rPr>
+          <w:rFonts w:ascii="Times New Roman" w:hAnsi="Times New Roman" w:cs="Times New Roman"/>
+        </w:rPr>
+        <w:br/>
+      </w:r>
       <w:r>
         <w:rPr>
           <w:rFonts w:ascii="Times New Roman" w:hAnsi="Times New Roman" w:cs="Times New Roman"/>
@@ -1097,352 +1381,6 @@
       <w:r>
         <w:rPr>
           <w:rFonts w:ascii="Times New Roman" w:hAnsi="Times New Roman" w:cs="Times New Roman"/>
-          <w:i/>
-          <w:color w:val="646464"/>
-        </w:rPr>
-        <w:t>Figure 3: Render.com — Environment Variables Configuration Panel</w:t>
-      </w:r>
-    </w:p>
-    <w:p>
-      <w:pPr>
-        <w:rPr>
-          <w:rFonts w:ascii="Times New Roman" w:hAnsi="Times New Roman" w:cs="Times New Roman"/>
-        </w:rPr>
-      </w:pPr>
-    </w:p>
-    <w:p>
-      <w:pPr>
-        <w:rPr>
-          <w:rFonts w:ascii="Times New Roman" w:hAnsi="Times New Roman" w:cs="Times New Roman"/>
-        </w:rPr>
-      </w:pPr>
-      <w:r>
-        <w:rPr>
-          <w:rFonts w:ascii="Times New Roman" w:hAnsi="Times New Roman" w:cs="Times New Roman"/>
-        </w:rPr>
-        <w:t>4. Step 3: Deployment &amp; Build Log</w:t>
-      </w:r>
-    </w:p>
-    <w:p>
-      <w:pPr>
-        <w:rPr>
-          <w:rFonts w:ascii="Times New Roman" w:hAnsi="Times New Roman" w:cs="Times New Roman"/>
-        </w:rPr>
-      </w:pPr>
-      <w:r>
-        <w:rPr>
-          <w:rFonts w:ascii="Times New Roman" w:hAnsi="Times New Roman" w:cs="Times New Roman"/>
-        </w:rPr>
-        <w:lastRenderedPageBreak/>
-        <w:t>After clicking 'Deploy Web Service', Render automatically pulled the latest code from GitHub, installed dependencies from requirements.txt, and started the Gunicorn WSGI server.</w:t>
-      </w:r>
-    </w:p>
-    <w:p>
-      <w:pPr>
-        <w:rPr>
-          <w:rFonts w:ascii="Times New Roman" w:hAnsi="Times New Roman" w:cs="Times New Roman"/>
-        </w:rPr>
-      </w:pPr>
-      <w:r>
-        <w:rPr>
-          <w:rFonts w:ascii="Times New Roman" w:hAnsi="Times New Roman" w:cs="Times New Roman"/>
-          <w:color w:val="005096"/>
-        </w:rPr>
-        <w:t>4.1  Build Process</w:t>
-      </w:r>
-    </w:p>
-    <w:p>
-      <w:pPr>
-        <w:rPr>
-          <w:rFonts w:ascii="Times New Roman" w:hAnsi="Times New Roman" w:cs="Times New Roman"/>
-        </w:rPr>
-      </w:pPr>
-      <w:r>
-        <w:rPr>
-          <w:rFonts w:ascii="Times New Roman" w:hAnsi="Times New Roman" w:cs="Times New Roman"/>
-          <w:color w:val="141450"/>
-        </w:rPr>
-        <w:t>==&gt; Cloning from https://github.com/NAYAN-014/Gaplense-.git</w:t>
-      </w:r>
-    </w:p>
-    <w:p>
-      <w:pPr>
-        <w:rPr>
-          <w:rFonts w:ascii="Times New Roman" w:hAnsi="Times New Roman" w:cs="Times New Roman"/>
-        </w:rPr>
-      </w:pPr>
-      <w:r>
-        <w:rPr>
-          <w:rFonts w:ascii="Times New Roman" w:hAnsi="Times New Roman" w:cs="Times New Roman"/>
-          <w:color w:val="141450"/>
-        </w:rPr>
-        <w:t>==&gt; Using Python version: 3.11.0</w:t>
-      </w:r>
-    </w:p>
-    <w:p>
-      <w:pPr>
-        <w:rPr>
-          <w:rFonts w:ascii="Times New Roman" w:hAnsi="Times New Roman" w:cs="Times New Roman"/>
-        </w:rPr>
-      </w:pPr>
-      <w:r>
-        <w:rPr>
-          <w:rFonts w:ascii="Times New Roman" w:hAnsi="Times New Roman" w:cs="Times New Roman"/>
-          <w:color w:val="141450"/>
-        </w:rPr>
-        <w:t>==&gt; Running build command: pip install -r requirements.txt</w:t>
-      </w:r>
-    </w:p>
-    <w:p>
-      <w:pPr>
-        <w:rPr>
-          <w:rFonts w:ascii="Times New Roman" w:hAnsi="Times New Roman" w:cs="Times New Roman"/>
-        </w:rPr>
-      </w:pPr>
-      <w:r>
-        <w:rPr>
-          <w:rFonts w:ascii="Times New Roman" w:hAnsi="Times New Roman" w:cs="Times New Roman"/>
-          <w:color w:val="141450"/>
-        </w:rPr>
-        <w:t xml:space="preserve">    Installing flask, pymongo, gunicorn...</w:t>
-      </w:r>
-    </w:p>
-    <w:p>
-      <w:pPr>
-        <w:rPr>
-          <w:rFonts w:ascii="Times New Roman" w:hAnsi="Times New Roman" w:cs="Times New Roman"/>
-        </w:rPr>
-      </w:pPr>
-      <w:r>
-        <w:rPr>
-          <w:rFonts w:ascii="Times New Roman" w:hAnsi="Times New Roman" w:cs="Times New Roman"/>
-          <w:color w:val="141450"/>
-        </w:rPr>
-        <w:t xml:space="preserve">    Successfully installed 42 packages</w:t>
-      </w:r>
-    </w:p>
-    <w:p>
-      <w:pPr>
-        <w:rPr>
-          <w:rFonts w:ascii="Times New Roman" w:hAnsi="Times New Roman" w:cs="Times New Roman"/>
-        </w:rPr>
-      </w:pPr>
-      <w:r>
-        <w:rPr>
-          <w:rFonts w:ascii="Times New Roman" w:hAnsi="Times New Roman" w:cs="Times New Roman"/>
-          <w:color w:val="141450"/>
-        </w:rPr>
-        <w:t xml:space="preserve">==&gt; Build successful </w:t>
-      </w:r>
-      <w:r>
-        <w:rPr>
-          <w:rFonts w:ascii="Segoe UI Symbol" w:hAnsi="Segoe UI Symbol" w:cs="Segoe UI Symbol"/>
-          <w:color w:val="141450"/>
-        </w:rPr>
-        <w:t>✓</w:t>
-      </w:r>
-    </w:p>
-    <w:p>
-      <w:pPr>
-        <w:rPr>
-          <w:rFonts w:ascii="Times New Roman" w:hAnsi="Times New Roman" w:cs="Times New Roman"/>
-        </w:rPr>
-      </w:pPr>
-    </w:p>
-    <w:p>
-      <w:pPr>
-        <w:rPr>
-          <w:rFonts w:ascii="Times New Roman" w:hAnsi="Times New Roman" w:cs="Times New Roman"/>
-        </w:rPr>
-      </w:pPr>
-      <w:r>
-        <w:rPr>
-          <w:rFonts w:ascii="Times New Roman" w:hAnsi="Times New Roman" w:cs="Times New Roman"/>
-          <w:color w:val="141450"/>
-        </w:rPr>
-        <w:t>==&gt; Starting service with: gunicorn run:app</w:t>
-      </w:r>
-    </w:p>
-    <w:p>
-      <w:pPr>
-        <w:rPr>
-          <w:rFonts w:ascii="Times New Roman" w:hAnsi="Times New Roman" w:cs="Times New Roman"/>
-        </w:rPr>
-      </w:pPr>
-      <w:r>
-        <w:rPr>
-          <w:rFonts w:ascii="Times New Roman" w:hAnsi="Times New Roman" w:cs="Times New Roman"/>
-          <w:color w:val="141450"/>
-        </w:rPr>
-        <w:t xml:space="preserve">    [INFO] Starting gunicorn 21.2.0</w:t>
-      </w:r>
-    </w:p>
-    <w:p>
-      <w:pPr>
-        <w:rPr>
-          <w:rFonts w:ascii="Times New Roman" w:hAnsi="Times New Roman" w:cs="Times New Roman"/>
-        </w:rPr>
-      </w:pPr>
-      <w:r>
-        <w:rPr>
-          <w:rFonts w:ascii="Times New Roman" w:hAnsi="Times New Roman" w:cs="Times New Roman"/>
-          <w:color w:val="141450"/>
-        </w:rPr>
-        <w:t xml:space="preserve">    [INFO] Listening at: http://0.0.0.0:10000</w:t>
-      </w:r>
-    </w:p>
-    <w:p>
-      <w:pPr>
-        <w:rPr>
-          <w:rFonts w:ascii="Times New Roman" w:hAnsi="Times New Roman" w:cs="Times New Roman"/>
-        </w:rPr>
-      </w:pPr>
-      <w:r>
-        <w:rPr>
-          <w:rFonts w:ascii="Times New Roman" w:hAnsi="Times New Roman" w:cs="Times New Roman"/>
-          <w:color w:val="141450"/>
-        </w:rPr>
-        <w:t xml:space="preserve">    [INFO] Worker(s) booted successfully</w:t>
-      </w:r>
-    </w:p>
-    <w:p>
-      <w:pPr>
-        <w:rPr>
-          <w:rFonts w:ascii="Times New Roman" w:hAnsi="Times New Roman" w:cs="Times New Roman"/>
-        </w:rPr>
-      </w:pPr>
-      <w:r>
-        <w:rPr>
-          <w:rFonts w:ascii="Times New Roman" w:hAnsi="Times New Roman" w:cs="Times New Roman"/>
-          <w:color w:val="141450"/>
-        </w:rPr>
-        <w:t xml:space="preserve">==&gt; Your service is live </w:t>
-      </w:r>
-      <w:r>
-        <w:rPr>
-          <w:rFonts w:ascii="Segoe UI Emoji" w:hAnsi="Segoe UI Emoji" w:cs="Segoe UI Emoji"/>
-          <w:color w:val="141450"/>
-        </w:rPr>
-        <w:t>🎉</w:t>
-      </w:r>
-    </w:p>
-    <w:p>
-      <w:pPr>
-        <w:rPr>
-          <w:rFonts w:ascii="Times New Roman" w:hAnsi="Times New Roman" w:cs="Times New Roman"/>
-        </w:rPr>
-      </w:pPr>
-    </w:p>
-    <w:p>
-      <w:pPr>
-        <w:rPr>
-          <w:rFonts w:ascii="Times New Roman" w:hAnsi="Times New Roman" w:cs="Times New Roman"/>
-        </w:rPr>
-      </w:pPr>
-      <w:r>
-        <w:rPr>
-          <w:rFonts w:ascii="Times New Roman" w:hAnsi="Times New Roman" w:cs="Times New Roman"/>
-          <w:color w:val="B47800"/>
-        </w:rPr>
-        <w:br/>
-      </w:r>
-      <w:r>
-        <w:rPr>
-          <w:rFonts w:ascii="Segoe UI Emoji" w:hAnsi="Segoe UI Emoji" w:cs="Segoe UI Emoji"/>
-          <w:color w:val="B47800"/>
-        </w:rPr>
-        <w:t>📷</w:t>
-      </w:r>
-      <w:r>
-        <w:rPr>
-          <w:rFonts w:ascii="Times New Roman" w:hAnsi="Times New Roman" w:cs="Times New Roman"/>
-          <w:color w:val="B47800"/>
-        </w:rPr>
-        <w:t xml:space="preserve">  [ INSERT SCREENSHOT HERE ]</w:t>
-      </w:r>
-      <w:r>
-        <w:rPr>
-          <w:rFonts w:ascii="Times New Roman" w:hAnsi="Times New Roman" w:cs="Times New Roman"/>
-          <w:color w:val="B47800"/>
-        </w:rPr>
-        <w:br/>
-      </w:r>
-      <w:r>
-        <w:rPr>
-          <w:rFonts w:ascii="Times New Roman" w:hAnsi="Times New Roman" w:cs="Times New Roman"/>
-          <w:color w:val="B47800"/>
-        </w:rPr>
-        <w:br/>
-      </w:r>
-    </w:p>
-    <w:p>
-      <w:pPr>
-        <w:rPr>
-          <w:rFonts w:ascii="Times New Roman" w:hAnsi="Times New Roman" w:cs="Times New Roman"/>
-        </w:rPr>
-      </w:pPr>
-      <w:r>
-        <w:rPr>
-          <w:rFonts w:ascii="Times New Roman" w:hAnsi="Times New Roman" w:cs="Times New Roman"/>
-        </w:rPr>
-        <w:br/>
-      </w:r>
-      <w:r>
-        <w:rPr>
-          <w:rFonts w:ascii="Times New Roman" w:hAnsi="Times New Roman" w:cs="Times New Roman"/>
-        </w:rPr>
-        <w:br/>
-      </w:r>
-      <w:r>
-        <w:rPr>
-          <w:rFonts w:ascii="Times New Roman" w:hAnsi="Times New Roman" w:cs="Times New Roman"/>
-        </w:rPr>
-        <w:br/>
-      </w:r>
-      <w:r>
-        <w:rPr>
-          <w:rFonts w:ascii="Times New Roman" w:hAnsi="Times New Roman" w:cs="Times New Roman"/>
-        </w:rPr>
-        <w:br/>
-      </w:r>
-      <w:r>
-        <w:rPr>
-          <w:rFonts w:ascii="Times New Roman" w:hAnsi="Times New Roman" w:cs="Times New Roman"/>
-        </w:rPr>
-        <w:br/>
-      </w:r>
-    </w:p>
-    <w:p>
-      <w:pPr>
-        <w:rPr>
-          <w:rFonts w:ascii="Times New Roman" w:hAnsi="Times New Roman" w:cs="Times New Roman"/>
-        </w:rPr>
-      </w:pPr>
-      <w:r>
-        <w:rPr>
-          <w:rFonts w:ascii="Times New Roman" w:hAnsi="Times New Roman" w:cs="Times New Roman"/>
-          <w:i/>
-          <w:color w:val="646464"/>
-        </w:rPr>
-        <w:t>Figure 4: Render.com — Build &amp; Deploy Log (Successful Deployment)</w:t>
-      </w:r>
-    </w:p>
-    <w:p>
-      <w:pPr>
-        <w:rPr>
-          <w:rFonts w:ascii="Times New Roman" w:hAnsi="Times New Roman" w:cs="Times New Roman"/>
-        </w:rPr>
-      </w:pPr>
-    </w:p>
-    <w:p>
-      <w:pPr>
-        <w:rPr>
-          <w:rFonts w:ascii="Times New Roman" w:hAnsi="Times New Roman" w:cs="Times New Roman"/>
-        </w:rPr>
-      </w:pPr>
-      <w:r>
-        <w:rPr>
-          <w:rFonts w:ascii="Times New Roman" w:hAnsi="Times New Roman" w:cs="Times New Roman"/>
           <w:color w:val="005096"/>
         </w:rPr>
         <w:t>4.2  Live URL Generated</w:t>
@@ -1528,20 +1466,6 @@
         <w:rPr>
           <w:rFonts w:ascii="Times New Roman" w:hAnsi="Times New Roman" w:cs="Times New Roman"/>
         </w:rPr>
-        <w:br w:type="page"/>
-      </w:r>
-    </w:p>
-    <w:p>
-      <w:pPr>
-        <w:rPr>
-          <w:rFonts w:ascii="Times New Roman" w:hAnsi="Times New Roman" w:cs="Times New Roman"/>
-        </w:rPr>
-      </w:pPr>
-      <w:r>
-        <w:rPr>
-          <w:rFonts w:ascii="Times New Roman" w:hAnsi="Times New Roman" w:cs="Times New Roman"/>
-        </w:rPr>
-        <w:lastRenderedPageBreak/>
         <w:t>5. Step 4: Live Output — Platform Screenshots</w:t>
       </w:r>
     </w:p>

</xml_diff>